<commit_message>
docs(.docs): define how survey answers become the user vector
Recommendation_System_Design_Ver1.1 §3.2 said survey answers are mapped
through the ontology but not how several answers touching the same
dimension combine. Each dimension is now the scale_value-weighted mean
of the answers whose dim_mask covers it, 0 when none does, and a zero
result is stored as NULL. Drop the architecture figure removed in 1.1
from the change log as well.

Refs: ANGI-28

Co-Authored-By: Claude Opus 5.5 <noreply@anthropic.com>
</commit_message>
<xml_diff>
--- a/.docs/Recommendation_System_Design_Ver1.1.docx
+++ b/.docs/Recommendation_System_Design_Ver1.1.docx
@@ -2915,13 +2915,45 @@
           <w:b/>
           <w:bCs/>
         </w:rPr>
-        <w:t>Explicit.</w:t>
-      </w:r>
-      <w:r>
-        <w:t xml:space="preserve"> Khi người dùng trả lời khảo sát, hệ thống xây dựng preference profile và quy thành user vector 12 chiều.</w:t>
-      </w:r>
-      <w:r>
-        <w:t xml:space="preserve"> Nếu người dùng bỏ qua khảo sát thì user vector là NULL và Explicit = 0. Vector người dùng được cập nhật sau mỗi lần like/dislike:</w:t>
+        <w:t xml:space="preserve">Explicit.</w:t>
+      </w:r>
+      <w:r>
+        <w:t xml:space="preserve"> Khi người dùng trả lời khảo sát, mỗi câu trả lời (option_code, scale_value) được quy về ontology qua bảng survey_option_vectors rồi gộp thành user vector 12 chiều, cùng không gian với dish vector. Với mỗi chiều d:</w:t>
+      </w:r>
+    </w:p>
+    <w:p>
+      <w:pPr>
+        <w:shd w:val="clear" w:color="auto" w:fill="F2F2F2"/>
+        <w:spacing w:before="60" w:after="0"/>
+        <w:ind w:left="360" w:right="360"/>
+      </w:pPr>
+      <w:r>
+        <w:t xml:space="preserve">User[d] = Σ_i ( s_i · vec_i[d] · mask_i[d] ) / Σ_i ( s_i · mask_i[d] );</w:t>
+      </w:r>
+    </w:p>
+    <w:p>
+      <w:pPr>
+        <w:shd w:val="clear" w:color="auto" w:fill="F2F2F2"/>
+        <w:spacing w:after="0"/>
+        <w:ind w:left="360" w:right="360"/>
+      </w:pPr>
+      <w:r>
+        <w:t xml:space="preserve">User[d] = 0 nếu Σ_i ( s_i · mask_i[d] ) = 0 (không câu trả lời nào chạm chiều d);</w:t>
+      </w:r>
+    </w:p>
+    <w:p>
+      <w:pPr>
+        <w:shd w:val="clear" w:color="auto" w:fill="F2F2F2"/>
+        <w:spacing w:after="140"/>
+        <w:ind w:left="360" w:right="360"/>
+      </w:pPr>
+      <w:r>
+        <w:t xml:space="preserve">Với s_i = scale_value của câu trả lời i (bỏ trống = 1); vec_i, mask_i = vec, dim_mask của option_code đó.</w:t>
+      </w:r>
+    </w:p>
+    <w:p>
+      <w:r>
+        <w:t xml:space="preserve">Kết quả lưu vào initial_vec và vec. Nếu người dùng bỏ qua khảo sát, hoặc kết quả là vector 0 (mọi chiều được chạm đều có giá trị 0), thì user vector là NULL và Explicit = 0. Vector người dùng được cập nhật sau mỗi lần like/dislike:</w:t>
       </w:r>
     </w:p>
     <w:p>
@@ -8417,6 +8449,18 @@
       </w:pPr>
       <w:r>
         <w:t>Bỏ "dị ứng" khỏi thuộc tính lọc (không có trong Data Dictionary); thêm lọc bán kính (mục 1.2, 2.5).</w:t>
+      </w:r>
+    </w:p>
+    <w:p>
+      <w:pPr>
+        <w:numPr>
+          <w:ilvl w:val="0"/>
+          <w:numId w:val="5"/>
+        </w:numPr>
+        <w:spacing w:after="0" w:line="288" w:lineRule="auto"/>
+      </w:pPr>
+      <w:r>
+        <w:t xml:space="preserve">Quy tắc gộp câu trả lời khảo sát thành user vector: trung bình có trọng số scale_value theo dim_mask trên từng chiều; kết quả là vector 0 thì lưu NULL (mục 3.2). Bỏ hình kiến trúc tổng thể ở mục 1.3.</w:t>
       </w:r>
     </w:p>
     <w:p>

</xml_diff>

<commit_message>
docs(.docs): define how survey answers become the user vector (#3)
Recommendation_System_Design_Ver1.1 §3.2 said survey answers are mapped
through the ontology but not how several answers touching the same
dimension combine. Each dimension is now the scale_value-weighted mean
of the answers whose dim_mask covers it, 0 when none does, and a zero
result is stored as NULL. Drop the architecture figure removed in 1.1
from the change log as well.

Refs: ANGI-28

Co-authored-by: Claude Opus 5.5 <noreply@anthropic.com>
</commit_message>
<xml_diff>
--- a/.docs/Recommendation_System_Design_Ver1.1.docx
+++ b/.docs/Recommendation_System_Design_Ver1.1.docx
@@ -2915,13 +2915,45 @@
           <w:b/>
           <w:bCs/>
         </w:rPr>
-        <w:t>Explicit.</w:t>
-      </w:r>
-      <w:r>
-        <w:t xml:space="preserve"> Khi người dùng trả lời khảo sát, hệ thống xây dựng preference profile và quy thành user vector 12 chiều.</w:t>
-      </w:r>
-      <w:r>
-        <w:t xml:space="preserve"> Nếu người dùng bỏ qua khảo sát thì user vector là NULL và Explicit = 0. Vector người dùng được cập nhật sau mỗi lần like/dislike:</w:t>
+        <w:t xml:space="preserve">Explicit.</w:t>
+      </w:r>
+      <w:r>
+        <w:t xml:space="preserve"> Khi người dùng trả lời khảo sát, mỗi câu trả lời (option_code, scale_value) được quy về ontology qua bảng survey_option_vectors rồi gộp thành user vector 12 chiều, cùng không gian với dish vector. Với mỗi chiều d:</w:t>
+      </w:r>
+    </w:p>
+    <w:p>
+      <w:pPr>
+        <w:shd w:val="clear" w:color="auto" w:fill="F2F2F2"/>
+        <w:spacing w:before="60" w:after="0"/>
+        <w:ind w:left="360" w:right="360"/>
+      </w:pPr>
+      <w:r>
+        <w:t xml:space="preserve">User[d] = Σ_i ( s_i · vec_i[d] · mask_i[d] ) / Σ_i ( s_i · mask_i[d] );</w:t>
+      </w:r>
+    </w:p>
+    <w:p>
+      <w:pPr>
+        <w:shd w:val="clear" w:color="auto" w:fill="F2F2F2"/>
+        <w:spacing w:after="0"/>
+        <w:ind w:left="360" w:right="360"/>
+      </w:pPr>
+      <w:r>
+        <w:t xml:space="preserve">User[d] = 0 nếu Σ_i ( s_i · mask_i[d] ) = 0 (không câu trả lời nào chạm chiều d);</w:t>
+      </w:r>
+    </w:p>
+    <w:p>
+      <w:pPr>
+        <w:shd w:val="clear" w:color="auto" w:fill="F2F2F2"/>
+        <w:spacing w:after="140"/>
+        <w:ind w:left="360" w:right="360"/>
+      </w:pPr>
+      <w:r>
+        <w:t xml:space="preserve">Với s_i = scale_value của câu trả lời i (bỏ trống = 1); vec_i, mask_i = vec, dim_mask của option_code đó.</w:t>
+      </w:r>
+    </w:p>
+    <w:p>
+      <w:r>
+        <w:t xml:space="preserve">Kết quả lưu vào initial_vec và vec. Nếu người dùng bỏ qua khảo sát, hoặc kết quả là vector 0 (mọi chiều được chạm đều có giá trị 0), thì user vector là NULL và Explicit = 0. Vector người dùng được cập nhật sau mỗi lần like/dislike:</w:t>
       </w:r>
     </w:p>
     <w:p>
@@ -8417,6 +8449,18 @@
       </w:pPr>
       <w:r>
         <w:t>Bỏ "dị ứng" khỏi thuộc tính lọc (không có trong Data Dictionary); thêm lọc bán kính (mục 1.2, 2.5).</w:t>
+      </w:r>
+    </w:p>
+    <w:p>
+      <w:pPr>
+        <w:numPr>
+          <w:ilvl w:val="0"/>
+          <w:numId w:val="5"/>
+        </w:numPr>
+        <w:spacing w:after="0" w:line="288" w:lineRule="auto"/>
+      </w:pPr>
+      <w:r>
+        <w:t xml:space="preserve">Quy tắc gộp câu trả lời khảo sát thành user vector: trung bình có trọng số scale_value theo dim_mask trên từng chiều; kết quả là vector 0 thì lưu NULL (mục 3.2). Bỏ hình kiến trúc tổng thể ở mục 1.3.</w:t>
       </w:r>
     </w:p>
     <w:p>

</xml_diff>

<commit_message>
docs(.docs): define how and when dish vectors are generated
Section 2.4 did not name the AI provider, say whether a vector is
generated right after RECO-01 or only by the background loop, what
happens to the old vector when the content changes, or how often a
failing dish is retried. Dish vectors now come from an OpenAI model set
by LLM_MODEL, generated in a background task right after RECO-01 with
the old vector cleared, and retried by the loop at most 5 times per
content; without LLM settings dishes stay pending.

Refs: ANGI-50

Co-Authored-By: Claude Opus 5.5 <noreply@anthropic.com>
</commit_message>
<xml_diff>
--- a/.docs/Recommendation_System_Design_Ver1.1.docx
+++ b/.docs/Recommendation_System_Design_Ver1.1.docx
@@ -2381,7 +2381,7 @@
         <w:spacing w:after="0" w:line="288" w:lineRule="auto"/>
       </w:pPr>
       <w:r>
-        <w:t>Nếu nội dung mới hoặc thay đổi, reco gọi AI với prompt chứa định nghĩa từng chiều và yêu cầu trả về JSON đủ 12 chiều.</w:t>
+        <w:t>Nếu nội dung mới hoặc thay đổi, reco gọi AI với prompt chứa định nghĩa từng chiều và yêu cầu trả về JSON đủ 12 chiều. AI là model của OpenAI, đặt bằng biến môi trường LLM_MODEL (key: LLM_API_KEY), trả lời theo JSON schema 12 khóa. RECO-01 trả lời ngay với status = pending và vec = NULL (vector cũ bị bỏ vì không còn khớp nội dung); vector được sinh trong tác vụ nền ngay sau đó.</w:t>
       </w:r>
     </w:p>
     <w:p>
@@ -2393,7 +2393,7 @@
         <w:spacing w:after="0" w:line="288" w:lineRule="auto"/>
       </w:pPr>
       <w:r>
-        <w:t>Kiểm tra kết quả: đủ 12 khóa, mọi giá trị thuộc [0, 1]. Khóa phải đúng tên 12 chiều: thiếu khóa hoặc có khóa lạ (kể cả tên chiều gõ sai) đều không hợp lệ. Giá trị không cần đúng thang rời rạc, chỉ cần là số thuộc [0, 1]. Vector toàn 0 không hợp lệ (dish_vectors.vec có CHECK khác vector 0). Nếu hợp lệ thì lưu vector, JSON gốc và tên mô hình (status = ready); nếu không thì đánh dấu failed. Reco tự chạy lại các món pending/failed bằng vòng lặp nền mỗi 5 phút.</w:t>
+        <w:t>Kiểm tra kết quả: đủ 12 khóa, mọi giá trị thuộc [0, 1]. Khóa phải đúng tên 12 chiều: thiếu khóa hoặc có khóa lạ (kể cả tên chiều gõ sai) đều không hợp lệ. Giá trị không cần đúng thang rời rạc, chỉ cần là số thuộc [0, 1]. Vector toàn 0 không hợp lệ (dish_vectors.vec có CHECK khác vector 0). Nếu hợp lệ thì lưu vector, JSON gốc và tên mô hình (status = ready); nếu không thì đánh dấu failed. Reco tự chạy lại các món pending/failed bằng vòng lặp nền mỗi 5 phút, tối đa 5 lần cho mỗi nội dung (attempt_count; nội dung mới đặt lại về 0). Món đã thử 5 lần vẫn failed, giữ last_error để kiểm tra. Chưa cấu hình LLM thì món giữ pending và không tính lần thử.</w:t>
       </w:r>
     </w:p>
     <w:p>

</xml_diff>

<commit_message>
feat: generate dish vectors with OpenAI (RECO-01, RECO-02) (#7)
RECO-05 needs dish vectors and the outbox worker needs RECO-01 and
RECO-02, but reco had neither. RECO-01 stores the dish and answers at
once; new content clears the old vector and an OpenAI model (LLM_MODEL)
scores it in a background task against a strict JSON schema of the 12
dimensions, validated by the ontology. Same content is unchanged and
not scored again, older events are stale, and an answer about content
that changed meanwhile is discarded.

A loop retries pending and failed dishes every 5 minutes, at most 5
times per content. RECO-02 deactivates a dish and keeps its vector.
scripts/backfill_dishes.py sends the existing active dishes once,
before the outbox worker exists. Section 2.4 of the design records
these rules.

Refs: ANGI-50
</commit_message>
<xml_diff>
--- a/.docs/Recommendation_System_Design_Ver1.1.docx
+++ b/.docs/Recommendation_System_Design_Ver1.1.docx
@@ -2381,7 +2381,7 @@
         <w:spacing w:after="0" w:line="288" w:lineRule="auto"/>
       </w:pPr>
       <w:r>
-        <w:t>Nếu nội dung mới hoặc thay đổi, reco gọi AI với prompt chứa định nghĩa từng chiều và yêu cầu trả về JSON đủ 12 chiều.</w:t>
+        <w:t>Nếu nội dung mới hoặc thay đổi, reco gọi AI với prompt chứa định nghĩa từng chiều và yêu cầu trả về JSON đủ 12 chiều. AI là model của OpenAI, đặt bằng biến môi trường LLM_MODEL (key: LLM_API_KEY), trả lời theo JSON schema 12 khóa. RECO-01 trả lời ngay với status = pending và vec = NULL (vector cũ bị bỏ vì không còn khớp nội dung); vector được sinh trong tác vụ nền ngay sau đó.</w:t>
       </w:r>
     </w:p>
     <w:p>
@@ -2393,7 +2393,7 @@
         <w:spacing w:after="0" w:line="288" w:lineRule="auto"/>
       </w:pPr>
       <w:r>
-        <w:t>Kiểm tra kết quả: đủ 12 khóa, mọi giá trị thuộc [0, 1]. Khóa phải đúng tên 12 chiều: thiếu khóa hoặc có khóa lạ (kể cả tên chiều gõ sai) đều không hợp lệ. Giá trị không cần đúng thang rời rạc, chỉ cần là số thuộc [0, 1]. Vector toàn 0 không hợp lệ (dish_vectors.vec có CHECK khác vector 0). Nếu hợp lệ thì lưu vector, JSON gốc và tên mô hình (status = ready); nếu không thì đánh dấu failed. Reco tự chạy lại các món pending/failed bằng vòng lặp nền mỗi 5 phút.</w:t>
+        <w:t>Kiểm tra kết quả: đủ 12 khóa, mọi giá trị thuộc [0, 1]. Khóa phải đúng tên 12 chiều: thiếu khóa hoặc có khóa lạ (kể cả tên chiều gõ sai) đều không hợp lệ. Giá trị không cần đúng thang rời rạc, chỉ cần là số thuộc [0, 1]. Vector toàn 0 không hợp lệ (dish_vectors.vec có CHECK khác vector 0). Nếu hợp lệ thì lưu vector, JSON gốc và tên mô hình (status = ready); nếu không thì đánh dấu failed. Reco tự chạy lại các món pending/failed bằng vòng lặp nền mỗi 5 phút, tối đa 5 lần cho mỗi nội dung (attempt_count; nội dung mới đặt lại về 0). Món đã thử 5 lần vẫn failed, giữ last_error để kiểm tra. Chưa cấu hình LLM thì món giữ pending và không tính lần thử.</w:t>
       </w:r>
     </w:p>
     <w:p>

</xml_diff>